<commit_message>
Port Douglas VP527224: final RevF fee proposal, response schedule, 6 RFQs
Co-Authored-By: Claude Opus 5.5 <noreply@anthropic.com>
Claude-Session: https://claude.ai/code/session_01RKGFyarCMuMinKYL7AiBap
</commit_message>
<xml_diff>
--- a/FP/VP527819/Final/JCE_FP_VP527819_Final_RevF.docx
+++ b/FP/VP527819/Final/JCE_FP_VP527819_Final_RevF.docx
@@ -8139,7 +8139,7 @@
         <w:rPr>
           <w:i w:val="0"/>
         </w:rPr>
-        <w:t>Each partner will hold public liability and professional indemnity insurance at Council's levels, or JCE's policies will respond for their work, and certificates will be supplied in Returnable 13.</w:t>
+        <w:t>Each partner will hold public liability and professional indemnity insurance at Council's levels, and their certificates will be supplied in Returnable 13.</w:t>
       </w:r>
     </w:p>
     <w:p>
@@ -8559,7 +8559,7 @@
               <w:rPr>
                 <w:sz w:val="17"/>
               </w:rPr>
-              <w:t>$200/hr  |  $1,600/day</w:t>
+              <w:t>$200/hr; $1,600/day</w:t>
             </w:r>
           </w:p>
         </w:tc>
@@ -8601,7 +8601,7 @@
               <w:rPr>
                 <w:sz w:val="17"/>
               </w:rPr>
-              <w:t>$200/hr  |  $1,600/day</w:t>
+              <w:t>$200/hr; $1,600/day</w:t>
             </w:r>
           </w:p>
         </w:tc>
@@ -8641,7 +8641,7 @@
               <w:rPr>
                 <w:sz w:val="17"/>
               </w:rPr>
-              <w:t>$190/hr  |  $1,520/day</w:t>
+              <w:t>$190/hr; $1,520/day</w:t>
             </w:r>
           </w:p>
         </w:tc>
@@ -8683,7 +8683,7 @@
               <w:rPr>
                 <w:sz w:val="17"/>
               </w:rPr>
-              <w:t>$180/hr  |  $1,440/day</w:t>
+              <w:t>$180/hr; $1,440/day</w:t>
             </w:r>
           </w:p>
         </w:tc>
@@ -8723,7 +8723,7 @@
               <w:rPr>
                 <w:sz w:val="17"/>
               </w:rPr>
-              <w:t>$170/hr  |  $1,360/day</w:t>
+              <w:t>$170/hr; $1,360/day</w:t>
             </w:r>
           </w:p>
         </w:tc>
@@ -8765,7 +8765,7 @@
               <w:rPr>
                 <w:sz w:val="17"/>
               </w:rPr>
-              <w:t>$160/hr  |  $1,280/day</w:t>
+              <w:t>$160/hr; $1,280/day</w:t>
             </w:r>
           </w:p>
         </w:tc>
@@ -8805,7 +8805,7 @@
               <w:rPr>
                 <w:sz w:val="17"/>
               </w:rPr>
-              <w:t>$140/hr  |  $1,120/day</w:t>
+              <w:t>$140/hr; $1,120/day</w:t>
             </w:r>
           </w:p>
         </w:tc>

</xml_diff>